<commit_message>
update docs including latest firmware updates
</commit_message>
<xml_diff>
--- a/TORO_PROXY.docx
+++ b/TORO_PROXY.docx
@@ -1,99 +1,224 @@
 
 <file path=word/document.xml><?xml version="1.0" encoding="utf-8"?>
-<w:document xmlns:wpc="http://schemas.microsoft.com/office/word/2010/wordprocessingCanvas" xmlns:cx="http://schemas.microsoft.com/office/drawing/2014/chartex" xmlns:cx1="http://schemas.microsoft.com/office/drawing/2015/9/8/chartex" xmlns:cx2="http://schemas.microsoft.com/office/drawing/2015/10/21/chartex" xmlns:cx3="http://schemas.microsoft.com/office/drawing/2016/5/9/chartex" xmlns:cx4="http://schemas.microsoft.com/office/drawing/2016/5/10/chartex" xmlns:cx5="http://schemas.microsoft.com/office/drawing/2016/5/11/chartex" xmlns:cx6="http://schemas.microsoft.com/office/drawing/2016/5/12/chartex" xmlns:cx7="http://schemas.microsoft.com/office/drawing/2016/5/13/chartex" xmlns:cx8="http://schemas.microsoft.com/office/drawing/2016/5/14/chartex" xmlns:mc="http://schemas.openxmlformats.org/markup-compatibility/2006" xmlns:aink="http://schemas.microsoft.com/office/drawing/2016/ink" xmlns:am3d="http://schemas.microsoft.com/office/drawing/2017/model3d" xmlns:o="urn:schemas-microsoft-com:office:office" xmlns:r="http://schemas.openxmlformats.org/officeDocument/2006/relationships" xmlns:m="http://schemas.openxmlformats.org/officeDocument/2006/math" xmlns:v="urn:schemas-microsoft-com:vml" xmlns:wp14="http://schemas.microsoft.com/office/word/2010/wordprocessingDrawing" xmlns:wp="http://schemas.openxmlformats.org/drawingml/2006/wordprocessingDrawing" xmlns:w10="urn:schemas-microsoft-com:office:word" xmlns:w="http://schemas.openxmlformats.org/wordprocessingml/2006/main" xmlns:w14="http://schemas.microsoft.com/office/word/2010/wordml" xmlns:w15="http://schemas.microsoft.com/office/word/2012/wordml" xmlns:w16cex="http://schemas.microsoft.com/office/word/2018/wordml/cex" xmlns:w16cid="http://schemas.microsoft.com/office/word/2016/wordml/cid" xmlns:w16="http://schemas.microsoft.com/office/word/2018/wordml" xmlns:w16sdtdh="http://schemas.microsoft.com/office/word/2020/wordml/sdtdatahash" xmlns:w16se="http://schemas.microsoft.com/office/word/2015/wordml/symex" xmlns:wpg="http://schemas.microsoft.com/office/word/2010/wordprocessingGroup" xmlns:wpi="http://schemas.microsoft.com/office/word/2010/wordprocessingInk" xmlns:wne="http://schemas.microsoft.com/office/word/2006/wordml" xmlns:wps="http://schemas.microsoft.com/office/word/2010/wordprocessingShape" mc:Ignorable="w14 w15 w16se w16cid w16 w16cex w16sdtdh wp14">
+<w:document xmlns:wpc="http://schemas.microsoft.com/office/word/2010/wordprocessingCanvas" xmlns:cx="http://schemas.microsoft.com/office/drawing/2014/chartex" xmlns:cx1="http://schemas.microsoft.com/office/drawing/2015/9/8/chartex" xmlns:cx2="http://schemas.microsoft.com/office/drawing/2015/10/21/chartex" xmlns:cx3="http://schemas.microsoft.com/office/drawing/2016/5/9/chartex" xmlns:cx4="http://schemas.microsoft.com/office/drawing/2016/5/10/chartex" xmlns:cx5="http://schemas.microsoft.com/office/drawing/2016/5/11/chartex" xmlns:cx6="http://schemas.microsoft.com/office/drawing/2016/5/12/chartex" xmlns:cx7="http://schemas.microsoft.com/office/drawing/2016/5/13/chartex" xmlns:cx8="http://schemas.microsoft.com/office/drawing/2016/5/14/chartex" xmlns:mc="http://schemas.openxmlformats.org/markup-compatibility/2006" xmlns:aink="http://schemas.microsoft.com/office/drawing/2016/ink" xmlns:am3d="http://schemas.microsoft.com/office/drawing/2017/model3d" xmlns:o="urn:schemas-microsoft-com:office:office" xmlns:oel="http://schemas.microsoft.com/office/2019/extlst" xmlns:r="http://schemas.openxmlformats.org/officeDocument/2006/relationships" xmlns:m="http://schemas.openxmlformats.org/officeDocument/2006/math" xmlns:v="urn:schemas-microsoft-com:vml" xmlns:wp14="http://schemas.microsoft.com/office/word/2010/wordprocessingDrawing" xmlns:wp="http://schemas.openxmlformats.org/drawingml/2006/wordprocessingDrawing" xmlns:w10="urn:schemas-microsoft-com:office:word" xmlns:w="http://schemas.openxmlformats.org/wordprocessingml/2006/main" xmlns:w14="http://schemas.microsoft.com/office/word/2010/wordml" xmlns:w15="http://schemas.microsoft.com/office/word/2012/wordml" xmlns:w16cex="http://schemas.microsoft.com/office/word/2018/wordml/cex" xmlns:w16cid="http://schemas.microsoft.com/office/word/2016/wordml/cid" xmlns:w16="http://schemas.microsoft.com/office/word/2018/wordml" xmlns:w16sdtdh="http://schemas.microsoft.com/office/word/2020/wordml/sdtdatahash" xmlns:w16se="http://schemas.microsoft.com/office/word/2015/wordml/symex" xmlns:wpg="http://schemas.microsoft.com/office/word/2010/wordprocessingGroup" xmlns:wpi="http://schemas.microsoft.com/office/word/2010/wordprocessingInk" xmlns:wne="http://schemas.microsoft.com/office/word/2006/wordml" xmlns:wps="http://schemas.microsoft.com/office/word/2010/wordprocessingShape" mc:Ignorable="w14 w15 w16se w16cid w16 w16cex w16sdtdh wp14">
   <w:body>
     <w:p>
       <w:pPr>
         <w:pStyle w:val="Toro1"/>
-      </w:pPr>
-      <w:r>
-        <w:t>У версії прошивки 0.5.4, якщо передбачена відповідна апаратна реалізація</w:t>
-      </w:r>
-      <w:r>
+        <w:spacing w:before="240" w:line="276" w:lineRule="auto"/>
+        <w:ind w:firstLine="709"/>
+        <w:rPr>
+          <w:rFonts w:ascii="Times New Roman" w:hAnsi="Times New Roman" w:cs="Times New Roman"/>
+        </w:rPr>
+      </w:pPr>
+      <w:r>
+        <w:rPr>
+          <w:rFonts w:ascii="Times New Roman" w:hAnsi="Times New Roman" w:cs="Times New Roman"/>
+        </w:rPr>
+        <w:t>У версі</w:t>
+      </w:r>
+      <w:r>
+        <w:rPr>
+          <w:rFonts w:ascii="Times New Roman" w:hAnsi="Times New Roman" w:cs="Times New Roman"/>
+        </w:rPr>
+        <w:t>ях</w:t>
+      </w:r>
+      <w:r>
+        <w:rPr>
+          <w:rFonts w:ascii="Times New Roman" w:hAnsi="Times New Roman" w:cs="Times New Roman"/>
+        </w:rPr>
+        <w:t xml:space="preserve"> прошивки 0.5.4</w:t>
+      </w:r>
+      <w:r>
+        <w:rPr>
+          <w:rFonts w:ascii="Times New Roman" w:hAnsi="Times New Roman" w:cs="Times New Roman"/>
+        </w:rPr>
+        <w:t xml:space="preserve"> і новіш</w:t>
+      </w:r>
+      <w:r>
+        <w:rPr>
+          <w:rFonts w:ascii="Times New Roman" w:hAnsi="Times New Roman" w:cs="Times New Roman"/>
+        </w:rPr>
+        <w:t>их</w:t>
+      </w:r>
+      <w:r>
+        <w:rPr>
+          <w:rFonts w:ascii="Times New Roman" w:hAnsi="Times New Roman" w:cs="Times New Roman"/>
+        </w:rPr>
+        <w:t>, якщо передбачена відповідна апаратна реалізація</w:t>
+      </w:r>
+      <w:r>
+        <w:rPr>
+          <w:rFonts w:ascii="Times New Roman" w:hAnsi="Times New Roman" w:cs="Times New Roman"/>
+        </w:rPr>
         <w:t>:</w:t>
       </w:r>
       <w:r>
+        <w:rPr>
+          <w:rFonts w:ascii="Times New Roman" w:hAnsi="Times New Roman" w:cs="Times New Roman"/>
+        </w:rPr>
         <w:t xml:space="preserve"> «зелений кейс»</w:t>
       </w:r>
       <w:r>
+        <w:rPr>
+          <w:rFonts w:ascii="Times New Roman" w:hAnsi="Times New Roman" w:cs="Times New Roman"/>
+        </w:rPr>
         <w:t>,</w:t>
       </w:r>
       <w:r>
-        <w:t xml:space="preserve"> з’явилась опція керувати наземною станцією використовуючи точку доступу</w:t>
-      </w:r>
-      <w:r>
+        <w:rPr>
+          <w:rFonts w:ascii="Times New Roman" w:hAnsi="Times New Roman" w:cs="Times New Roman"/>
+        </w:rPr>
+        <w:t xml:space="preserve"> з’явилась опція керувати наземною станцією</w:t>
+      </w:r>
+      <w:r>
+        <w:rPr>
+          <w:rFonts w:ascii="Times New Roman" w:hAnsi="Times New Roman" w:cs="Times New Roman"/>
+        </w:rPr>
+        <w:t>,</w:t>
+      </w:r>
+      <w:r>
+        <w:rPr>
+          <w:rFonts w:ascii="Times New Roman" w:hAnsi="Times New Roman" w:cs="Times New Roman"/>
+        </w:rPr>
+        <w:t xml:space="preserve"> використовуючи точку доступу Wi-Fi</w:t>
+      </w:r>
+      <w:r>
+        <w:rPr>
+          <w:rFonts w:ascii="Times New Roman" w:hAnsi="Times New Roman" w:cs="Times New Roman"/>
+        </w:rPr>
+        <w:t>,</w:t>
+      </w:r>
+      <w:r>
+        <w:rPr>
+          <w:rFonts w:ascii="Times New Roman" w:hAnsi="Times New Roman" w:cs="Times New Roman"/>
+          <w:lang w:val="en-US"/>
+        </w:rPr>
         <w:t xml:space="preserve"> </w:t>
       </w:r>
-      <w:proofErr w:type="spellStart"/>
-      <w:r>
-        <w:t>Wi-Fi</w:t>
-      </w:r>
-      <w:proofErr w:type="spellEnd"/>
-      <w:r>
+      <w:r>
+        <w:rPr>
+          <w:rFonts w:ascii="Times New Roman" w:hAnsi="Times New Roman" w:cs="Times New Roman"/>
+        </w:rPr>
+        <w:t>яка вбудована безпосередньо в кейс</w:t>
+      </w:r>
+      <w:r>
+        <w:rPr>
+          <w:rFonts w:ascii="Times New Roman" w:hAnsi="Times New Roman" w:cs="Times New Roman"/>
+        </w:rPr>
         <w:t>,</w:t>
       </w:r>
       <w:r>
         <w:rPr>
+          <w:rFonts w:ascii="Times New Roman" w:hAnsi="Times New Roman" w:cs="Times New Roman"/>
+        </w:rPr>
+        <w:t xml:space="preserve"> веб</w:t>
+      </w:r>
+      <w:r>
+        <w:rPr>
+          <w:rFonts w:ascii="Times New Roman" w:hAnsi="Times New Roman" w:cs="Times New Roman"/>
+        </w:rPr>
+        <w:t>-</w:t>
+      </w:r>
+      <w:r>
+        <w:rPr>
+          <w:rFonts w:ascii="Times New Roman" w:hAnsi="Times New Roman" w:cs="Times New Roman"/>
+        </w:rPr>
+        <w:t>інтерфейс при цьому не змінився</w:t>
+      </w:r>
+      <w:r>
+        <w:rPr>
+          <w:rFonts w:ascii="Times New Roman" w:hAnsi="Times New Roman" w:cs="Times New Roman"/>
+        </w:rPr>
+        <w:t xml:space="preserve">. </w:t>
+      </w:r>
+      <w:r>
+        <w:rPr>
+          <w:rFonts w:ascii="Times New Roman" w:hAnsi="Times New Roman" w:cs="Times New Roman"/>
+        </w:rPr>
+        <w:t>Апаратно н</w:t>
+      </w:r>
+      <w:r>
+        <w:rPr>
+          <w:rFonts w:ascii="Times New Roman" w:hAnsi="Times New Roman" w:cs="Times New Roman"/>
+        </w:rPr>
+        <w:t>аземний</w:t>
+      </w:r>
+      <w:r>
+        <w:rPr>
+          <w:rFonts w:ascii="Times New Roman" w:hAnsi="Times New Roman" w:cs="Times New Roman"/>
+        </w:rPr>
+        <w:t xml:space="preserve"> </w:t>
+      </w:r>
+      <w:r>
+        <w:rPr>
+          <w:rFonts w:ascii="Times New Roman" w:hAnsi="Times New Roman" w:cs="Times New Roman"/>
+        </w:rPr>
+        <w:t>(додатковий) мікроконтролер виступає свого роду клієнтом</w:t>
+      </w:r>
+      <w:r>
+        <w:rPr>
+          <w:rFonts w:ascii="Times New Roman" w:hAnsi="Times New Roman" w:cs="Times New Roman"/>
+        </w:rPr>
+        <w:t xml:space="preserve"> </w:t>
+      </w:r>
+      <w:r>
+        <w:rPr>
+          <w:rFonts w:ascii="Times New Roman" w:hAnsi="Times New Roman" w:cs="Times New Roman"/>
+        </w:rPr>
+        <w:t>(проксі) мікроконтролера</w:t>
+      </w:r>
+      <w:r>
+        <w:rPr>
+          <w:rFonts w:ascii="Times New Roman" w:hAnsi="Times New Roman" w:cs="Times New Roman"/>
+        </w:rPr>
+        <w:t>,</w:t>
+      </w:r>
+      <w:r>
+        <w:rPr>
+          <w:rFonts w:ascii="Times New Roman" w:hAnsi="Times New Roman" w:cs="Times New Roman"/>
+        </w:rPr>
+        <w:t xml:space="preserve"> який знаходиться в голові антенного виносу, відсилаючи команди і отримуючи данні по дроту.</w:t>
+      </w:r>
+      <w:r>
+        <w:rPr>
+          <w:rFonts w:ascii="Times New Roman" w:hAnsi="Times New Roman" w:cs="Times New Roman"/>
+        </w:rPr>
+        <w:t xml:space="preserve"> Таким чином зникає проблема слабкого Wi-Fi</w:t>
+      </w:r>
+      <w:r>
+        <w:rPr>
+          <w:rFonts w:ascii="Times New Roman" w:hAnsi="Times New Roman" w:cs="Times New Roman"/>
           <w:lang w:val="en-US"/>
         </w:rPr>
         <w:t xml:space="preserve"> </w:t>
       </w:r>
       <w:r>
-        <w:t>яка вбудована безпосередньо в кейс</w:t>
-      </w:r>
-      <w:r>
-        <w:t xml:space="preserve"> веб інтерфейс при цьому не змінився</w:t>
-      </w:r>
-      <w:r>
-        <w:t xml:space="preserve">. </w:t>
-      </w:r>
-      <w:r>
-        <w:t>Апаратно н</w:t>
-      </w:r>
-      <w:r>
-        <w:t>аземний</w:t>
-      </w:r>
-      <w:r>
+        <w:rPr>
+          <w:rFonts w:ascii="Times New Roman" w:hAnsi="Times New Roman" w:cs="Times New Roman"/>
+        </w:rPr>
+        <w:t>при роботі з наземною станцією.</w:t>
+      </w:r>
+      <w:r>
+        <w:rPr>
+          <w:rFonts w:ascii="Times New Roman" w:hAnsi="Times New Roman" w:cs="Times New Roman"/>
+        </w:rPr>
         <w:t xml:space="preserve"> </w:t>
-      </w:r>
-      <w:r>
-        <w:t>(додатковий) мікроконтролер виступає свого роду клієнтом</w:t>
-      </w:r>
-      <w:r>
-        <w:t xml:space="preserve"> </w:t>
-      </w:r>
-      <w:r>
-        <w:t>(проксі) мікроконтролера</w:t>
-      </w:r>
-      <w:r>
-        <w:t>,</w:t>
-      </w:r>
-      <w:r>
-        <w:t xml:space="preserve"> який знаходиться в голові антенного виносу, відсилаючи команди і отримуючи данні по дроту.</w:t>
-      </w:r>
-      <w:r>
-        <w:t xml:space="preserve"> Таким чином зникає проблема слабкого </w:t>
-      </w:r>
-      <w:proofErr w:type="spellStart"/>
-      <w:r>
-        <w:t>Wi-Fi</w:t>
-      </w:r>
-      <w:proofErr w:type="spellEnd"/>
-      <w:r>
-        <w:rPr>
-          <w:lang w:val="en-US"/>
-        </w:rPr>
-        <w:t xml:space="preserve"> </w:t>
-      </w:r>
-      <w:r>
-        <w:t>при роботі з наземною станцією.</w:t>
       </w:r>
     </w:p>
     <w:p>
       <w:pPr>
         <w:pStyle w:val="Toro1"/>
-      </w:pPr>
-      <w:r>
+        <w:spacing w:before="240" w:line="276" w:lineRule="auto"/>
+        <w:ind w:firstLine="709"/>
+        <w:rPr>
+          <w:rFonts w:ascii="Times New Roman" w:hAnsi="Times New Roman" w:cs="Times New Roman"/>
+        </w:rPr>
+      </w:pPr>
+      <w:r>
+        <w:rPr>
+          <w:rFonts w:ascii="Times New Roman" w:hAnsi="Times New Roman" w:cs="Times New Roman"/>
+        </w:rPr>
         <w:t>В роботу наземної станції для оперування точками доступу покладено наступний алгоритм:</w:t>
       </w:r>
     </w:p>
@@ -104,15 +229,22 @@
           <w:ilvl w:val="0"/>
           <w:numId w:val="10"/>
         </w:numPr>
-        <w:rPr>
+        <w:spacing w:before="240" w:line="276" w:lineRule="auto"/>
+        <w:ind w:left="851"/>
+        <w:rPr>
+          <w:rFonts w:ascii="Times New Roman" w:hAnsi="Times New Roman" w:cs="Times New Roman"/>
           <w:lang w:val="en-US"/>
         </w:rPr>
       </w:pPr>
       <w:r>
+        <w:rPr>
+          <w:rFonts w:ascii="Times New Roman" w:hAnsi="Times New Roman" w:cs="Times New Roman"/>
+        </w:rPr>
         <w:t xml:space="preserve">Після подачі живлення, піднімається точка доступу антенного виносу скажімо з назвою </w:t>
       </w:r>
       <w:r>
         <w:rPr>
+          <w:rFonts w:ascii="Times New Roman" w:hAnsi="Times New Roman" w:cs="Times New Roman"/>
           <w:lang w:val="en-US"/>
         </w:rPr>
         <w:t>Toro11.</w:t>
@@ -125,11 +257,17 @@
           <w:ilvl w:val="0"/>
           <w:numId w:val="10"/>
         </w:numPr>
-        <w:rPr>
+        <w:spacing w:before="240" w:line="276" w:lineRule="auto"/>
+        <w:ind w:left="851"/>
+        <w:rPr>
+          <w:rFonts w:ascii="Times New Roman" w:hAnsi="Times New Roman" w:cs="Times New Roman"/>
           <w:lang w:val="en-US"/>
         </w:rPr>
       </w:pPr>
       <w:r>
+        <w:rPr>
+          <w:rFonts w:ascii="Times New Roman" w:hAnsi="Times New Roman" w:cs="Times New Roman"/>
+        </w:rPr>
         <w:t>Паралельно «кейс» посилає команди на встановлення зв’язку по дроту з антенним виносом.</w:t>
       </w:r>
     </w:p>
@@ -140,53 +278,69 @@
           <w:ilvl w:val="0"/>
           <w:numId w:val="10"/>
         </w:numPr>
-        <w:rPr>
+        <w:spacing w:before="240" w:line="276" w:lineRule="auto"/>
+        <w:ind w:left="851"/>
+        <w:rPr>
+          <w:rFonts w:ascii="Times New Roman" w:hAnsi="Times New Roman" w:cs="Times New Roman"/>
           <w:lang w:val="en-US"/>
         </w:rPr>
       </w:pPr>
       <w:r>
+        <w:rPr>
+          <w:rFonts w:ascii="Times New Roman" w:hAnsi="Times New Roman" w:cs="Times New Roman"/>
+        </w:rPr>
         <w:t xml:space="preserve">Якщо зв'язок встановлено то «кейс» підіймає власну точку доступу з назвою </w:t>
       </w:r>
       <w:r>
         <w:rPr>
+          <w:rFonts w:ascii="Times New Roman" w:hAnsi="Times New Roman" w:cs="Times New Roman"/>
           <w:lang w:val="en-US"/>
         </w:rPr>
+        <w:t>Toro11_G</w:t>
+      </w:r>
+      <w:r>
+        <w:rPr>
+          <w:rFonts w:ascii="Times New Roman" w:hAnsi="Times New Roman" w:cs="Times New Roman"/>
+        </w:rPr>
+        <w:t xml:space="preserve">, де </w:t>
+      </w:r>
+      <w:r>
+        <w:rPr>
+          <w:rFonts w:ascii="Times New Roman" w:hAnsi="Times New Roman" w:cs="Times New Roman"/>
+          <w:lang w:val="en-US"/>
+        </w:rPr>
+        <w:t xml:space="preserve">G </w:t>
+      </w:r>
+      <w:r>
+        <w:rPr>
+          <w:rFonts w:ascii="Times New Roman" w:hAnsi="Times New Roman" w:cs="Times New Roman"/>
+        </w:rPr>
+        <w:t xml:space="preserve">– це </w:t>
+      </w:r>
+      <w:r>
+        <w:rPr>
+          <w:rFonts w:ascii="Times New Roman" w:hAnsi="Times New Roman" w:cs="Times New Roman"/>
+          <w:lang w:val="en-US"/>
+        </w:rPr>
+        <w:t>Ground</w:t>
+      </w:r>
+      <w:r>
+        <w:rPr>
+          <w:rFonts w:ascii="Times New Roman" w:hAnsi="Times New Roman" w:cs="Times New Roman"/>
+        </w:rPr>
+        <w:t xml:space="preserve">; за 60 секунд точка доступу антенного виносу </w:t>
+      </w:r>
+      <w:r>
+        <w:rPr>
+          <w:rFonts w:ascii="Times New Roman" w:hAnsi="Times New Roman" w:cs="Times New Roman"/>
+          <w:lang w:val="en-US"/>
+        </w:rPr>
         <w:t>Toro11</w:t>
       </w:r>
       <w:r>
         <w:rPr>
-          <w:lang w:val="en-US"/>
-        </w:rPr>
-        <w:t>_G</w:t>
-      </w:r>
-      <w:r>
-        <w:t xml:space="preserve">, де </w:t>
-      </w:r>
-      <w:r>
-        <w:rPr>
-          <w:lang w:val="en-US"/>
-        </w:rPr>
-        <w:t xml:space="preserve">G </w:t>
-      </w:r>
-      <w:r>
-        <w:t xml:space="preserve">– це </w:t>
-      </w:r>
-      <w:r>
-        <w:rPr>
-          <w:lang w:val="en-US"/>
-        </w:rPr>
-        <w:t>Ground</w:t>
-      </w:r>
-      <w:r>
-        <w:t xml:space="preserve">, а не те що ви подумали; за 60 секунд точка доступу антенного виносу </w:t>
-      </w:r>
-      <w:r>
-        <w:rPr>
-          <w:lang w:val="en-US"/>
-        </w:rPr>
-        <w:t>Toro11</w:t>
-      </w:r>
-      <w:r>
+          <w:rFonts w:ascii="Times New Roman" w:hAnsi="Times New Roman" w:cs="Times New Roman"/>
+        </w:rPr>
         <w:t xml:space="preserve"> вимикається.</w:t>
       </w:r>
     </w:p>
@@ -197,9 +351,29 @@
           <w:ilvl w:val="0"/>
           <w:numId w:val="10"/>
         </w:numPr>
-      </w:pPr>
-      <w:r>
-        <w:t>У випадку відсутності дротового з’єднання (пошкоджена жила дроту наприклад) точка доступу антенного виносу не зникне.</w:t>
+        <w:spacing w:before="240" w:line="276" w:lineRule="auto"/>
+        <w:ind w:left="851"/>
+        <w:rPr>
+          <w:rFonts w:ascii="Times New Roman" w:hAnsi="Times New Roman" w:cs="Times New Roman"/>
+        </w:rPr>
+      </w:pPr>
+      <w:r>
+        <w:rPr>
+          <w:rFonts w:ascii="Times New Roman" w:hAnsi="Times New Roman" w:cs="Times New Roman"/>
+        </w:rPr>
+        <w:t>У випадку відсутності дротового з’єднання (пошкоджена жила дроту</w:t>
+      </w:r>
+      <w:r>
+        <w:rPr>
+          <w:rFonts w:ascii="Times New Roman" w:hAnsi="Times New Roman" w:cs="Times New Roman"/>
+        </w:rPr>
+        <w:t>,</w:t>
+      </w:r>
+      <w:r>
+        <w:rPr>
+          <w:rFonts w:ascii="Times New Roman" w:hAnsi="Times New Roman" w:cs="Times New Roman"/>
+        </w:rPr>
+        <w:t xml:space="preserve"> наприклад) точка доступу антенного виносу не зникне.</w:t>
       </w:r>
     </w:p>
     <w:p>
@@ -209,18 +383,27 @@
           <w:ilvl w:val="0"/>
           <w:numId w:val="10"/>
         </w:numPr>
-      </w:pPr>
-      <w:r>
+        <w:spacing w:before="240" w:line="276" w:lineRule="auto"/>
+        <w:ind w:left="851"/>
+        <w:rPr>
+          <w:rFonts w:ascii="Times New Roman" w:hAnsi="Times New Roman" w:cs="Times New Roman"/>
+        </w:rPr>
+      </w:pPr>
+      <w:r>
+        <w:rPr>
+          <w:rFonts w:ascii="Times New Roman" w:hAnsi="Times New Roman" w:cs="Times New Roman"/>
+          <w:noProof/>
+        </w:rPr>
         <w:drawing>
-          <wp:anchor distT="0" distB="0" distL="114300" distR="114300" simplePos="0" relativeHeight="251801088" behindDoc="0" locked="0" layoutInCell="1" allowOverlap="1" wp14:anchorId="161D51DC" wp14:editId="7496F83B">
+          <wp:anchor distT="0" distB="0" distL="114300" distR="114300" simplePos="0" relativeHeight="251801088" behindDoc="0" locked="0" layoutInCell="1" allowOverlap="1" wp14:anchorId="161D51DC" wp14:editId="62A01A41">
             <wp:simplePos x="0" y="0"/>
             <wp:positionH relativeFrom="margin">
-              <wp:posOffset>4465320</wp:posOffset>
+              <wp:posOffset>5138420</wp:posOffset>
             </wp:positionH>
             <wp:positionV relativeFrom="paragraph">
-              <wp:posOffset>40005</wp:posOffset>
+              <wp:posOffset>158115</wp:posOffset>
             </wp:positionV>
-            <wp:extent cx="2206625" cy="3054350"/>
+            <wp:extent cx="1558925" cy="2157730"/>
             <wp:effectExtent l="0" t="0" r="3175" b="0"/>
             <wp:wrapSquare wrapText="bothSides"/>
             <wp:docPr id="33" name="Picture 33"/>
@@ -242,7 +425,7 @@
                   <pic:spPr bwMode="auto">
                     <a:xfrm>
                       <a:off x="0" y="0"/>
-                      <a:ext cx="2206625" cy="3054350"/>
+                      <a:ext cx="1558925" cy="2157730"/>
                     </a:xfrm>
                     <a:prstGeom prst="rect">
                       <a:avLst/>
@@ -259,6 +442,9 @@
                 </pic:pic>
               </a:graphicData>
             </a:graphic>
+            <wp14:sizeRelH relativeFrom="margin">
+              <wp14:pctWidth>0</wp14:pctWidth>
+            </wp14:sizeRelH>
             <wp14:sizeRelV relativeFrom="margin">
               <wp14:pctHeight>0</wp14:pctHeight>
             </wp14:sizeRelV>
@@ -266,37 +452,76 @@
         </w:drawing>
       </w:r>
       <w:r>
+        <w:rPr>
+          <w:rFonts w:ascii="Times New Roman" w:hAnsi="Times New Roman" w:cs="Times New Roman"/>
+        </w:rPr>
         <w:t xml:space="preserve">Таким чином користувач може працювати виключно з </w:t>
       </w:r>
-      <w:proofErr w:type="spellStart"/>
-      <w:r>
-        <w:t>Wi-Fi</w:t>
-      </w:r>
-      <w:proofErr w:type="spellEnd"/>
-      <w:r>
-        <w:t xml:space="preserve"> кейса, без необхідності підключатись до </w:t>
-      </w:r>
-      <w:proofErr w:type="spellStart"/>
-      <w:r>
-        <w:t>Wi-Fi</w:t>
-      </w:r>
-      <w:proofErr w:type="spellEnd"/>
-      <w:r>
-        <w:t xml:space="preserve"> антенного виносу. Проте </w:t>
-      </w:r>
-      <w:r>
+      <w:r>
+        <w:rPr>
+          <w:rFonts w:ascii="Times New Roman" w:hAnsi="Times New Roman" w:cs="Times New Roman"/>
+        </w:rPr>
+        <w:t xml:space="preserve">Wi-Fi кейса, без необхідності підключатись до Wi-Fi антенного виносу. Проте </w:t>
+      </w:r>
+      <w:r>
+        <w:rPr>
+          <w:rFonts w:ascii="Times New Roman" w:hAnsi="Times New Roman" w:cs="Times New Roman"/>
+        </w:rPr>
         <w:t>можливість працювати виключно з виносом є</w:t>
       </w:r>
       <w:r>
-        <w:t xml:space="preserve">, оскільки по-перше комусь так може зручніше і по-друге приєднатись до </w:t>
-      </w:r>
-      <w:proofErr w:type="spellStart"/>
-      <w:r>
-        <w:t>Wi-Fi</w:t>
-      </w:r>
-      <w:proofErr w:type="spellEnd"/>
-      <w:r>
-        <w:t xml:space="preserve"> виносу необхідно для оновлення прошивки. </w:t>
+        <w:rPr>
+          <w:rFonts w:ascii="Times New Roman" w:hAnsi="Times New Roman" w:cs="Times New Roman"/>
+        </w:rPr>
+        <w:t>, оскільки</w:t>
+      </w:r>
+      <w:r>
+        <w:rPr>
+          <w:rFonts w:ascii="Times New Roman" w:hAnsi="Times New Roman" w:cs="Times New Roman"/>
+        </w:rPr>
+        <w:t>,</w:t>
+      </w:r>
+      <w:r>
+        <w:rPr>
+          <w:rFonts w:ascii="Times New Roman" w:hAnsi="Times New Roman" w:cs="Times New Roman"/>
+        </w:rPr>
+        <w:t xml:space="preserve"> по-перше</w:t>
+      </w:r>
+      <w:r>
+        <w:rPr>
+          <w:rFonts w:ascii="Times New Roman" w:hAnsi="Times New Roman" w:cs="Times New Roman"/>
+        </w:rPr>
+        <w:t>,</w:t>
+      </w:r>
+      <w:r>
+        <w:rPr>
+          <w:rFonts w:ascii="Times New Roman" w:hAnsi="Times New Roman" w:cs="Times New Roman"/>
+        </w:rPr>
+        <w:t xml:space="preserve"> комусь так зручніше і</w:t>
+      </w:r>
+      <w:r>
+        <w:rPr>
+          <w:rFonts w:ascii="Times New Roman" w:hAnsi="Times New Roman" w:cs="Times New Roman"/>
+        </w:rPr>
+        <w:t>,</w:t>
+      </w:r>
+      <w:r>
+        <w:rPr>
+          <w:rFonts w:ascii="Times New Roman" w:hAnsi="Times New Roman" w:cs="Times New Roman"/>
+        </w:rPr>
+        <w:t xml:space="preserve"> по-друге</w:t>
+      </w:r>
+      <w:r>
+        <w:rPr>
+          <w:rFonts w:ascii="Times New Roman" w:hAnsi="Times New Roman" w:cs="Times New Roman"/>
+        </w:rPr>
+        <w:t>,</w:t>
+      </w:r>
+      <w:r>
+        <w:rPr>
+          <w:rFonts w:ascii="Times New Roman" w:hAnsi="Times New Roman" w:cs="Times New Roman"/>
+        </w:rPr>
+        <w:t xml:space="preserve"> приєднатись до Wi-Fi виносу необхідно для оновлення прошивки. </w:t>
       </w:r>
     </w:p>
     <w:p>
@@ -306,41 +531,69 @@
           <w:ilvl w:val="0"/>
           <w:numId w:val="10"/>
         </w:numPr>
-      </w:pPr>
-      <w:r>
+        <w:spacing w:before="240" w:line="276" w:lineRule="auto"/>
+        <w:ind w:left="851"/>
+        <w:rPr>
+          <w:rFonts w:ascii="Times New Roman" w:hAnsi="Times New Roman" w:cs="Times New Roman"/>
+        </w:rPr>
+      </w:pPr>
+      <w:r>
+        <w:rPr>
+          <w:rFonts w:ascii="Times New Roman" w:hAnsi="Times New Roman" w:cs="Times New Roman"/>
+        </w:rPr>
         <w:t>Для того</w:t>
       </w:r>
       <w:r>
+        <w:rPr>
+          <w:rFonts w:ascii="Times New Roman" w:hAnsi="Times New Roman" w:cs="Times New Roman"/>
+        </w:rPr>
         <w:t>,</w:t>
       </w:r>
       <w:r>
+        <w:rPr>
+          <w:rFonts w:ascii="Times New Roman" w:hAnsi="Times New Roman" w:cs="Times New Roman"/>
+        </w:rPr>
         <w:t xml:space="preserve"> щоб</w:t>
       </w:r>
       <w:r>
+        <w:rPr>
+          <w:rFonts w:ascii="Times New Roman" w:hAnsi="Times New Roman" w:cs="Times New Roman"/>
+        </w:rPr>
         <w:t xml:space="preserve"> точка доступу </w:t>
       </w:r>
-      <w:proofErr w:type="spellStart"/>
-      <w:r>
-        <w:t>Wi-Fi</w:t>
-      </w:r>
-      <w:proofErr w:type="spellEnd"/>
-      <w:r>
-        <w:t xml:space="preserve"> </w:t>
-      </w:r>
-      <w:r>
+      <w:r>
+        <w:rPr>
+          <w:rFonts w:ascii="Times New Roman" w:hAnsi="Times New Roman" w:cs="Times New Roman"/>
+        </w:rPr>
+        <w:t xml:space="preserve">Wi-Fi </w:t>
+      </w:r>
+      <w:r>
+        <w:rPr>
+          <w:rFonts w:ascii="Times New Roman" w:hAnsi="Times New Roman" w:cs="Times New Roman"/>
+        </w:rPr>
         <w:t xml:space="preserve">антенного </w:t>
       </w:r>
       <w:r>
+        <w:rPr>
+          <w:rFonts w:ascii="Times New Roman" w:hAnsi="Times New Roman" w:cs="Times New Roman"/>
+        </w:rPr>
         <w:t>виносу не вимика</w:t>
       </w:r>
       <w:r>
+        <w:rPr>
+          <w:rFonts w:ascii="Times New Roman" w:hAnsi="Times New Roman" w:cs="Times New Roman"/>
+        </w:rPr>
         <w:t>лася</w:t>
       </w:r>
       <w:r>
+        <w:rPr>
+          <w:rFonts w:ascii="Times New Roman" w:hAnsi="Times New Roman" w:cs="Times New Roman"/>
+        </w:rPr>
         <w:t xml:space="preserve"> через 60 секунд потрібно програмно від’єднати кейс від виносу, для цього в системному меню вимикаємо перемикач «</w:t>
       </w:r>
       <w:r>
         <w:rPr>
+          <w:rFonts w:ascii="Times New Roman" w:hAnsi="Times New Roman" w:cs="Times New Roman"/>
           <w:b/>
           <w:bCs/>
           <w:lang w:val="en-US"/>
@@ -348,26 +601,45 @@
         <w:t>Allow wire</w:t>
       </w:r>
       <w:r>
+        <w:rPr>
+          <w:rFonts w:ascii="Times New Roman" w:hAnsi="Times New Roman" w:cs="Times New Roman"/>
+        </w:rPr>
         <w:t xml:space="preserve">». </w:t>
       </w:r>
       <w:r>
-        <w:t>Рекомендуємо це робити з веб інтерфейсу саме «кейса» у цьому випадку автоматично перезавантажиться і модуль виносу, після чого він заборонить зв'язок по дроту</w:t>
-      </w:r>
-      <w:r>
-        <w:t xml:space="preserve">, і як результат </w:t>
-      </w:r>
-      <w:proofErr w:type="spellStart"/>
-      <w:r>
-        <w:t>Wi-Fi</w:t>
-      </w:r>
-      <w:proofErr w:type="spellEnd"/>
-      <w:r>
-        <w:t xml:space="preserve"> виносу не вимкнеться, а кейсу</w:t>
-      </w:r>
-      <w:r>
+        <w:rPr>
+          <w:rFonts w:ascii="Times New Roman" w:hAnsi="Times New Roman" w:cs="Times New Roman"/>
+        </w:rPr>
+        <w:t>Рекомендуємо це робити з веб інтерфейсу саме «кейса»</w:t>
+      </w:r>
+      <w:r>
+        <w:rPr>
+          <w:rFonts w:ascii="Times New Roman" w:hAnsi="Times New Roman" w:cs="Times New Roman"/>
+        </w:rPr>
+        <w:t>,</w:t>
+      </w:r>
+      <w:r>
+        <w:rPr>
+          <w:rFonts w:ascii="Times New Roman" w:hAnsi="Times New Roman" w:cs="Times New Roman"/>
+        </w:rPr>
+        <w:t xml:space="preserve"> у цьому випадку автоматично перезавантажиться і модуль виносу, після чого він заборонить зв'язок по дроту</w:t>
+      </w:r>
+      <w:r>
+        <w:rPr>
+          <w:rFonts w:ascii="Times New Roman" w:hAnsi="Times New Roman" w:cs="Times New Roman"/>
+        </w:rPr>
+        <w:t>, і як результат Wi-Fi виносу не вимкнеться, а кейсу</w:t>
+      </w:r>
+      <w:r>
+        <w:rPr>
+          <w:rFonts w:ascii="Times New Roman" w:hAnsi="Times New Roman" w:cs="Times New Roman"/>
+        </w:rPr>
         <w:t xml:space="preserve"> не</w:t>
       </w:r>
       <w:r>
+        <w:rPr>
+          <w:rFonts w:ascii="Times New Roman" w:hAnsi="Times New Roman" w:cs="Times New Roman"/>
+        </w:rPr>
         <w:t xml:space="preserve"> ввімкнеться.</w:t>
       </w:r>
     </w:p>
@@ -378,24 +650,45 @@
           <w:ilvl w:val="0"/>
           <w:numId w:val="10"/>
         </w:numPr>
-      </w:pPr>
-      <w:r>
+        <w:spacing w:before="240" w:line="276" w:lineRule="auto"/>
+        <w:ind w:left="851"/>
+        <w:rPr>
+          <w:rFonts w:ascii="Times New Roman" w:hAnsi="Times New Roman" w:cs="Times New Roman"/>
+        </w:rPr>
+      </w:pPr>
+      <w:r>
+        <w:rPr>
+          <w:rFonts w:ascii="Times New Roman" w:hAnsi="Times New Roman" w:cs="Times New Roman"/>
+        </w:rPr>
         <w:t xml:space="preserve">Для відновлення дротового з’єднання </w:t>
       </w:r>
       <w:r>
+        <w:rPr>
+          <w:rFonts w:ascii="Times New Roman" w:hAnsi="Times New Roman" w:cs="Times New Roman"/>
+        </w:rPr>
         <w:t xml:space="preserve">та роботи з кейса </w:t>
       </w:r>
       <w:r>
+        <w:rPr>
+          <w:rFonts w:ascii="Times New Roman" w:hAnsi="Times New Roman" w:cs="Times New Roman"/>
+        </w:rPr>
         <w:t xml:space="preserve">в штатному режимі </w:t>
       </w:r>
       <w:r>
+        <w:rPr>
+          <w:rFonts w:ascii="Times New Roman" w:hAnsi="Times New Roman" w:cs="Times New Roman"/>
+        </w:rPr>
         <w:t xml:space="preserve">потрібно повернути прапорець </w:t>
       </w:r>
       <w:r>
+        <w:rPr>
+          <w:rFonts w:ascii="Times New Roman" w:hAnsi="Times New Roman" w:cs="Times New Roman"/>
+        </w:rPr>
         <w:t>«</w:t>
       </w:r>
       <w:r>
         <w:rPr>
+          <w:rFonts w:ascii="Times New Roman" w:hAnsi="Times New Roman" w:cs="Times New Roman"/>
           <w:b/>
           <w:bCs/>
           <w:lang w:val="en-US"/>
@@ -403,30 +696,34 @@
         <w:t>Allow wire</w:t>
       </w:r>
       <w:r>
+        <w:rPr>
+          <w:rFonts w:ascii="Times New Roman" w:hAnsi="Times New Roman" w:cs="Times New Roman"/>
+        </w:rPr>
         <w:t xml:space="preserve">» </w:t>
       </w:r>
       <w:r>
+        <w:rPr>
+          <w:rFonts w:ascii="Times New Roman" w:hAnsi="Times New Roman" w:cs="Times New Roman"/>
+        </w:rPr>
         <w:t>в положення «</w:t>
       </w:r>
-      <w:proofErr w:type="spellStart"/>
-      <w:r>
+      <w:r>
+        <w:rPr>
+          <w:rFonts w:ascii="Times New Roman" w:hAnsi="Times New Roman" w:cs="Times New Roman"/>
+        </w:rPr>
         <w:t>увімкнено</w:t>
       </w:r>
-      <w:proofErr w:type="spellEnd"/>
-      <w:r>
+      <w:r>
+        <w:rPr>
+          <w:rFonts w:ascii="Times New Roman" w:hAnsi="Times New Roman" w:cs="Times New Roman"/>
+        </w:rPr>
         <w:t>»</w:t>
       </w:r>
       <w:r>
+        <w:rPr>
+          <w:rFonts w:ascii="Times New Roman" w:hAnsi="Times New Roman" w:cs="Times New Roman"/>
+        </w:rPr>
         <w:t>.</w:t>
-      </w:r>
-    </w:p>
-    <w:p>
-      <w:pPr>
-        <w:pStyle w:val="Toro1"/>
-        <w:ind w:left="360" w:firstLine="0"/>
-      </w:pPr>
-      <w:r>
-        <w:t>По великому рахунку для користувача нічого не змінилось в плані керування наземною станцією, окрім необхідності підключатись до іншої точки доступу.</w:t>
       </w:r>
     </w:p>
     <w:sectPr>
@@ -441,7 +738,7 @@
 </file>
 
 <file path=word/endnotes.xml><?xml version="1.0" encoding="utf-8"?>
-<w:endnotes xmlns:wpc="http://schemas.microsoft.com/office/word/2010/wordprocessingCanvas" xmlns:cx="http://schemas.microsoft.com/office/drawing/2014/chartex" xmlns:cx1="http://schemas.microsoft.com/office/drawing/2015/9/8/chartex" xmlns:cx2="http://schemas.microsoft.com/office/drawing/2015/10/21/chartex" xmlns:cx3="http://schemas.microsoft.com/office/drawing/2016/5/9/chartex" xmlns:cx4="http://schemas.microsoft.com/office/drawing/2016/5/10/chartex" xmlns:cx5="http://schemas.microsoft.com/office/drawing/2016/5/11/chartex" xmlns:cx6="http://schemas.microsoft.com/office/drawing/2016/5/12/chartex" xmlns:cx7="http://schemas.microsoft.com/office/drawing/2016/5/13/chartex" xmlns:cx8="http://schemas.microsoft.com/office/drawing/2016/5/14/chartex" xmlns:mc="http://schemas.openxmlformats.org/markup-compatibility/2006" xmlns:aink="http://schemas.microsoft.com/office/drawing/2016/ink" xmlns:am3d="http://schemas.microsoft.com/office/drawing/2017/model3d" xmlns:o="urn:schemas-microsoft-com:office:office" xmlns:r="http://schemas.openxmlformats.org/officeDocument/2006/relationships" xmlns:m="http://schemas.openxmlformats.org/officeDocument/2006/math" xmlns:v="urn:schemas-microsoft-com:vml" xmlns:wp14="http://schemas.microsoft.com/office/word/2010/wordprocessingDrawing" xmlns:wp="http://schemas.openxmlformats.org/drawingml/2006/wordprocessingDrawing" xmlns:w10="urn:schemas-microsoft-com:office:word" xmlns:w="http://schemas.openxmlformats.org/wordprocessingml/2006/main" xmlns:w14="http://schemas.microsoft.com/office/word/2010/wordml" xmlns:w15="http://schemas.microsoft.com/office/word/2012/wordml" xmlns:w16cex="http://schemas.microsoft.com/office/word/2018/wordml/cex" xmlns:w16cid="http://schemas.microsoft.com/office/word/2016/wordml/cid" xmlns:w16="http://schemas.microsoft.com/office/word/2018/wordml" xmlns:w16sdtdh="http://schemas.microsoft.com/office/word/2020/wordml/sdtdatahash" xmlns:w16se="http://schemas.microsoft.com/office/word/2015/wordml/symex" xmlns:wpg="http://schemas.microsoft.com/office/word/2010/wordprocessingGroup" xmlns:wpi="http://schemas.microsoft.com/office/word/2010/wordprocessingInk" xmlns:wne="http://schemas.microsoft.com/office/word/2006/wordml" xmlns:wps="http://schemas.microsoft.com/office/word/2010/wordprocessingShape" mc:Ignorable="w14 w15 w16se w16cid w16 w16cex w16sdtdh wp14">
+<w:endnotes xmlns:wpc="http://schemas.microsoft.com/office/word/2010/wordprocessingCanvas" xmlns:cx="http://schemas.microsoft.com/office/drawing/2014/chartex" xmlns:cx1="http://schemas.microsoft.com/office/drawing/2015/9/8/chartex" xmlns:cx2="http://schemas.microsoft.com/office/drawing/2015/10/21/chartex" xmlns:cx3="http://schemas.microsoft.com/office/drawing/2016/5/9/chartex" xmlns:cx4="http://schemas.microsoft.com/office/drawing/2016/5/10/chartex" xmlns:cx5="http://schemas.microsoft.com/office/drawing/2016/5/11/chartex" xmlns:cx6="http://schemas.microsoft.com/office/drawing/2016/5/12/chartex" xmlns:cx7="http://schemas.microsoft.com/office/drawing/2016/5/13/chartex" xmlns:cx8="http://schemas.microsoft.com/office/drawing/2016/5/14/chartex" xmlns:mc="http://schemas.openxmlformats.org/markup-compatibility/2006" xmlns:aink="http://schemas.microsoft.com/office/drawing/2016/ink" xmlns:am3d="http://schemas.microsoft.com/office/drawing/2017/model3d" xmlns:o="urn:schemas-microsoft-com:office:office" xmlns:oel="http://schemas.microsoft.com/office/2019/extlst" xmlns:r="http://schemas.openxmlformats.org/officeDocument/2006/relationships" xmlns:m="http://schemas.openxmlformats.org/officeDocument/2006/math" xmlns:v="urn:schemas-microsoft-com:vml" xmlns:wp14="http://schemas.microsoft.com/office/word/2010/wordprocessingDrawing" xmlns:wp="http://schemas.openxmlformats.org/drawingml/2006/wordprocessingDrawing" xmlns:w10="urn:schemas-microsoft-com:office:word" xmlns:w="http://schemas.openxmlformats.org/wordprocessingml/2006/main" xmlns:w14="http://schemas.microsoft.com/office/word/2010/wordml" xmlns:w15="http://schemas.microsoft.com/office/word/2012/wordml" xmlns:w16cex="http://schemas.microsoft.com/office/word/2018/wordml/cex" xmlns:w16cid="http://schemas.microsoft.com/office/word/2016/wordml/cid" xmlns:w16="http://schemas.microsoft.com/office/word/2018/wordml" xmlns:w16sdtdh="http://schemas.microsoft.com/office/word/2020/wordml/sdtdatahash" xmlns:w16se="http://schemas.microsoft.com/office/word/2015/wordml/symex" xmlns:wpg="http://schemas.microsoft.com/office/word/2010/wordprocessingGroup" xmlns:wpi="http://schemas.microsoft.com/office/word/2010/wordprocessingInk" xmlns:wne="http://schemas.microsoft.com/office/word/2006/wordml" xmlns:wps="http://schemas.microsoft.com/office/word/2010/wordprocessingShape" mc:Ignorable="w14 w15 w16se w16cid w16 w16cex w16sdtdh wp14">
   <w:endnote w:type="separator" w:id="-1">
     <w:p>
       <w:r>
@@ -462,30 +759,56 @@
 </file>
 
 <file path=word/footer1.xml><?xml version="1.0" encoding="utf-8"?>
-<w:ftr xmlns:wpc="http://schemas.microsoft.com/office/word/2010/wordprocessingCanvas" xmlns:cx="http://schemas.microsoft.com/office/drawing/2014/chartex" xmlns:cx1="http://schemas.microsoft.com/office/drawing/2015/9/8/chartex" xmlns:cx2="http://schemas.microsoft.com/office/drawing/2015/10/21/chartex" xmlns:cx3="http://schemas.microsoft.com/office/drawing/2016/5/9/chartex" xmlns:cx4="http://schemas.microsoft.com/office/drawing/2016/5/10/chartex" xmlns:cx5="http://schemas.microsoft.com/office/drawing/2016/5/11/chartex" xmlns:cx6="http://schemas.microsoft.com/office/drawing/2016/5/12/chartex" xmlns:cx7="http://schemas.microsoft.com/office/drawing/2016/5/13/chartex" xmlns:cx8="http://schemas.microsoft.com/office/drawing/2016/5/14/chartex" xmlns:mc="http://schemas.openxmlformats.org/markup-compatibility/2006" xmlns:aink="http://schemas.microsoft.com/office/drawing/2016/ink" xmlns:am3d="http://schemas.microsoft.com/office/drawing/2017/model3d" xmlns:o="urn:schemas-microsoft-com:office:office" xmlns:r="http://schemas.openxmlformats.org/officeDocument/2006/relationships" xmlns:m="http://schemas.openxmlformats.org/officeDocument/2006/math" xmlns:v="urn:schemas-microsoft-com:vml" xmlns:wp14="http://schemas.microsoft.com/office/word/2010/wordprocessingDrawing" xmlns:wp="http://schemas.openxmlformats.org/drawingml/2006/wordprocessingDrawing" xmlns:w10="urn:schemas-microsoft-com:office:word" xmlns:w="http://schemas.openxmlformats.org/wordprocessingml/2006/main" xmlns:w14="http://schemas.microsoft.com/office/word/2010/wordml" xmlns:w15="http://schemas.microsoft.com/office/word/2012/wordml" xmlns:w16cex="http://schemas.microsoft.com/office/word/2018/wordml/cex" xmlns:w16cid="http://schemas.microsoft.com/office/word/2016/wordml/cid" xmlns:w16="http://schemas.microsoft.com/office/word/2018/wordml" xmlns:w16sdtdh="http://schemas.microsoft.com/office/word/2020/wordml/sdtdatahash" xmlns:w16se="http://schemas.microsoft.com/office/word/2015/wordml/symex" xmlns:wpg="http://schemas.microsoft.com/office/word/2010/wordprocessingGroup" xmlns:wpi="http://schemas.microsoft.com/office/word/2010/wordprocessingInk" xmlns:wne="http://schemas.microsoft.com/office/word/2006/wordml" xmlns:wps="http://schemas.microsoft.com/office/word/2010/wordprocessingShape" mc:Ignorable="w14 w15 w16se w16cid w16 w16cex w16sdtdh wp14">
+<w:ftr xmlns:wpc="http://schemas.microsoft.com/office/word/2010/wordprocessingCanvas" xmlns:cx="http://schemas.microsoft.com/office/drawing/2014/chartex" xmlns:cx1="http://schemas.microsoft.com/office/drawing/2015/9/8/chartex" xmlns:cx2="http://schemas.microsoft.com/office/drawing/2015/10/21/chartex" xmlns:cx3="http://schemas.microsoft.com/office/drawing/2016/5/9/chartex" xmlns:cx4="http://schemas.microsoft.com/office/drawing/2016/5/10/chartex" xmlns:cx5="http://schemas.microsoft.com/office/drawing/2016/5/11/chartex" xmlns:cx6="http://schemas.microsoft.com/office/drawing/2016/5/12/chartex" xmlns:cx7="http://schemas.microsoft.com/office/drawing/2016/5/13/chartex" xmlns:cx8="http://schemas.microsoft.com/office/drawing/2016/5/14/chartex" xmlns:mc="http://schemas.openxmlformats.org/markup-compatibility/2006" xmlns:aink="http://schemas.microsoft.com/office/drawing/2016/ink" xmlns:am3d="http://schemas.microsoft.com/office/drawing/2017/model3d" xmlns:o="urn:schemas-microsoft-com:office:office" xmlns:oel="http://schemas.microsoft.com/office/2019/extlst" xmlns:r="http://schemas.openxmlformats.org/officeDocument/2006/relationships" xmlns:m="http://schemas.openxmlformats.org/officeDocument/2006/math" xmlns:v="urn:schemas-microsoft-com:vml" xmlns:wp14="http://schemas.microsoft.com/office/word/2010/wordprocessingDrawing" xmlns:wp="http://schemas.openxmlformats.org/drawingml/2006/wordprocessingDrawing" xmlns:w10="urn:schemas-microsoft-com:office:word" xmlns:w="http://schemas.openxmlformats.org/wordprocessingml/2006/main" xmlns:w14="http://schemas.microsoft.com/office/word/2010/wordml" xmlns:w15="http://schemas.microsoft.com/office/word/2012/wordml" xmlns:w16cex="http://schemas.microsoft.com/office/word/2018/wordml/cex" xmlns:w16cid="http://schemas.microsoft.com/office/word/2016/wordml/cid" xmlns:w16="http://schemas.microsoft.com/office/word/2018/wordml" xmlns:w16sdtdh="http://schemas.microsoft.com/office/word/2020/wordml/sdtdatahash" xmlns:w16se="http://schemas.microsoft.com/office/word/2015/wordml/symex" xmlns:wpg="http://schemas.microsoft.com/office/word/2010/wordprocessingGroup" xmlns:wpi="http://schemas.microsoft.com/office/word/2010/wordprocessingInk" xmlns:wne="http://schemas.microsoft.com/office/word/2006/wordml" xmlns:wps="http://schemas.microsoft.com/office/word/2010/wordprocessingShape" mc:Ignorable="w14 w15 w16se w16cid w16 w16cex w16sdtdh wp14">
   <w:p>
     <w:pPr>
       <w:pStyle w:val="Normal1"/>
       <w:jc w:val="center"/>
+      <w:rPr>
+        <w:rFonts w:ascii="Times New Roman" w:hAnsi="Times New Roman" w:cs="Times New Roman"/>
+        <w:sz w:val="28"/>
+        <w:szCs w:val="28"/>
+      </w:rPr>
     </w:pPr>
     <w:r>
+      <w:rPr>
+        <w:rFonts w:ascii="Times New Roman" w:hAnsi="Times New Roman" w:cs="Times New Roman"/>
+        <w:sz w:val="28"/>
+        <w:szCs w:val="28"/>
+      </w:rPr>
       <w:fldChar w:fldCharType="begin"/>
     </w:r>
     <w:r>
+      <w:rPr>
+        <w:rFonts w:ascii="Times New Roman" w:hAnsi="Times New Roman" w:cs="Times New Roman"/>
+        <w:sz w:val="28"/>
+        <w:szCs w:val="28"/>
+      </w:rPr>
       <w:instrText>PAGE</w:instrText>
     </w:r>
     <w:r>
+      <w:rPr>
+        <w:rFonts w:ascii="Times New Roman" w:hAnsi="Times New Roman" w:cs="Times New Roman"/>
+        <w:sz w:val="28"/>
+        <w:szCs w:val="28"/>
+      </w:rPr>
       <w:fldChar w:fldCharType="separate"/>
     </w:r>
     <w:r>
       <w:rPr>
+        <w:rFonts w:ascii="Times New Roman" w:hAnsi="Times New Roman" w:cs="Times New Roman"/>
         <w:noProof/>
+        <w:sz w:val="28"/>
+        <w:szCs w:val="28"/>
       </w:rPr>
       <w:t>1</w:t>
     </w:r>
     <w:r>
       <w:rPr>
+        <w:rFonts w:ascii="Times New Roman" w:hAnsi="Times New Roman" w:cs="Times New Roman"/>
         <w:noProof/>
+        <w:sz w:val="28"/>
+        <w:szCs w:val="28"/>
       </w:rPr>
       <w:fldChar w:fldCharType="end"/>
     </w:r>
@@ -495,7 +818,7 @@
 </file>
 
 <file path=word/footnotes.xml><?xml version="1.0" encoding="utf-8"?>
-<w:footnotes xmlns:wpc="http://schemas.microsoft.com/office/word/2010/wordprocessingCanvas" xmlns:cx="http://schemas.microsoft.com/office/drawing/2014/chartex" xmlns:cx1="http://schemas.microsoft.com/office/drawing/2015/9/8/chartex" xmlns:cx2="http://schemas.microsoft.com/office/drawing/2015/10/21/chartex" xmlns:cx3="http://schemas.microsoft.com/office/drawing/2016/5/9/chartex" xmlns:cx4="http://schemas.microsoft.com/office/drawing/2016/5/10/chartex" xmlns:cx5="http://schemas.microsoft.com/office/drawing/2016/5/11/chartex" xmlns:cx6="http://schemas.microsoft.com/office/drawing/2016/5/12/chartex" xmlns:cx7="http://schemas.microsoft.com/office/drawing/2016/5/13/chartex" xmlns:cx8="http://schemas.microsoft.com/office/drawing/2016/5/14/chartex" xmlns:mc="http://schemas.openxmlformats.org/markup-compatibility/2006" xmlns:aink="http://schemas.microsoft.com/office/drawing/2016/ink" xmlns:am3d="http://schemas.microsoft.com/office/drawing/2017/model3d" xmlns:o="urn:schemas-microsoft-com:office:office" xmlns:r="http://schemas.openxmlformats.org/officeDocument/2006/relationships" xmlns:m="http://schemas.openxmlformats.org/officeDocument/2006/math" xmlns:v="urn:schemas-microsoft-com:vml" xmlns:wp14="http://schemas.microsoft.com/office/word/2010/wordprocessingDrawing" xmlns:wp="http://schemas.openxmlformats.org/drawingml/2006/wordprocessingDrawing" xmlns:w10="urn:schemas-microsoft-com:office:word" xmlns:w="http://schemas.openxmlformats.org/wordprocessingml/2006/main" xmlns:w14="http://schemas.microsoft.com/office/word/2010/wordml" xmlns:w15="http://schemas.microsoft.com/office/word/2012/wordml" xmlns:w16cex="http://schemas.microsoft.com/office/word/2018/wordml/cex" xmlns:w16cid="http://schemas.microsoft.com/office/word/2016/wordml/cid" xmlns:w16="http://schemas.microsoft.com/office/word/2018/wordml" xmlns:w16sdtdh="http://schemas.microsoft.com/office/word/2020/wordml/sdtdatahash" xmlns:w16se="http://schemas.microsoft.com/office/word/2015/wordml/symex" xmlns:wpg="http://schemas.microsoft.com/office/word/2010/wordprocessingGroup" xmlns:wpi="http://schemas.microsoft.com/office/word/2010/wordprocessingInk" xmlns:wne="http://schemas.microsoft.com/office/word/2006/wordml" xmlns:wps="http://schemas.microsoft.com/office/word/2010/wordprocessingShape" mc:Ignorable="w14 w15 w16se w16cid w16 w16cex w16sdtdh wp14">
+<w:footnotes xmlns:wpc="http://schemas.microsoft.com/office/word/2010/wordprocessingCanvas" xmlns:cx="http://schemas.microsoft.com/office/drawing/2014/chartex" xmlns:cx1="http://schemas.microsoft.com/office/drawing/2015/9/8/chartex" xmlns:cx2="http://schemas.microsoft.com/office/drawing/2015/10/21/chartex" xmlns:cx3="http://schemas.microsoft.com/office/drawing/2016/5/9/chartex" xmlns:cx4="http://schemas.microsoft.com/office/drawing/2016/5/10/chartex" xmlns:cx5="http://schemas.microsoft.com/office/drawing/2016/5/11/chartex" xmlns:cx6="http://schemas.microsoft.com/office/drawing/2016/5/12/chartex" xmlns:cx7="http://schemas.microsoft.com/office/drawing/2016/5/13/chartex" xmlns:cx8="http://schemas.microsoft.com/office/drawing/2016/5/14/chartex" xmlns:mc="http://schemas.openxmlformats.org/markup-compatibility/2006" xmlns:aink="http://schemas.microsoft.com/office/drawing/2016/ink" xmlns:am3d="http://schemas.microsoft.com/office/drawing/2017/model3d" xmlns:o="urn:schemas-microsoft-com:office:office" xmlns:oel="http://schemas.microsoft.com/office/2019/extlst" xmlns:r="http://schemas.openxmlformats.org/officeDocument/2006/relationships" xmlns:m="http://schemas.openxmlformats.org/officeDocument/2006/math" xmlns:v="urn:schemas-microsoft-com:vml" xmlns:wp14="http://schemas.microsoft.com/office/word/2010/wordprocessingDrawing" xmlns:wp="http://schemas.openxmlformats.org/drawingml/2006/wordprocessingDrawing" xmlns:w10="urn:schemas-microsoft-com:office:word" xmlns:w="http://schemas.openxmlformats.org/wordprocessingml/2006/main" xmlns:w14="http://schemas.microsoft.com/office/word/2010/wordml" xmlns:w15="http://schemas.microsoft.com/office/word/2012/wordml" xmlns:w16cex="http://schemas.microsoft.com/office/word/2018/wordml/cex" xmlns:w16cid="http://schemas.microsoft.com/office/word/2016/wordml/cid" xmlns:w16="http://schemas.microsoft.com/office/word/2018/wordml" xmlns:w16sdtdh="http://schemas.microsoft.com/office/word/2020/wordml/sdtdatahash" xmlns:w16se="http://schemas.microsoft.com/office/word/2015/wordml/symex" xmlns:wpg="http://schemas.microsoft.com/office/word/2010/wordprocessingGroup" xmlns:wpi="http://schemas.microsoft.com/office/word/2010/wordprocessingInk" xmlns:wne="http://schemas.microsoft.com/office/word/2006/wordml" xmlns:wps="http://schemas.microsoft.com/office/word/2010/wordprocessingShape" mc:Ignorable="w14 w15 w16se w16cid w16 w16cex w16sdtdh wp14">
   <w:footnote w:type="separator" w:id="-1">
     <w:p>
       <w:r>
@@ -516,7 +839,7 @@
 </file>
 
 <file path=word/numbering.xml><?xml version="1.0" encoding="utf-8"?>
-<w:numbering xmlns:wpc="http://schemas.microsoft.com/office/word/2010/wordprocessingCanvas" xmlns:cx="http://schemas.microsoft.com/office/drawing/2014/chartex" xmlns:cx1="http://schemas.microsoft.com/office/drawing/2015/9/8/chartex" xmlns:cx2="http://schemas.microsoft.com/office/drawing/2015/10/21/chartex" xmlns:cx3="http://schemas.microsoft.com/office/drawing/2016/5/9/chartex" xmlns:cx4="http://schemas.microsoft.com/office/drawing/2016/5/10/chartex" xmlns:cx5="http://schemas.microsoft.com/office/drawing/2016/5/11/chartex" xmlns:cx6="http://schemas.microsoft.com/office/drawing/2016/5/12/chartex" xmlns:cx7="http://schemas.microsoft.com/office/drawing/2016/5/13/chartex" xmlns:cx8="http://schemas.microsoft.com/office/drawing/2016/5/14/chartex" xmlns:mc="http://schemas.openxmlformats.org/markup-compatibility/2006" xmlns:aink="http://schemas.microsoft.com/office/drawing/2016/ink" xmlns:am3d="http://schemas.microsoft.com/office/drawing/2017/model3d" xmlns:o="urn:schemas-microsoft-com:office:office" xmlns:r="http://schemas.openxmlformats.org/officeDocument/2006/relationships" xmlns:m="http://schemas.openxmlformats.org/officeDocument/2006/math" xmlns:v="urn:schemas-microsoft-com:vml" xmlns:wp14="http://schemas.microsoft.com/office/word/2010/wordprocessingDrawing" xmlns:wp="http://schemas.openxmlformats.org/drawingml/2006/wordprocessingDrawing" xmlns:w10="urn:schemas-microsoft-com:office:word" xmlns:w="http://schemas.openxmlformats.org/wordprocessingml/2006/main" xmlns:w14="http://schemas.microsoft.com/office/word/2010/wordml" xmlns:w15="http://schemas.microsoft.com/office/word/2012/wordml" xmlns:w16cex="http://schemas.microsoft.com/office/word/2018/wordml/cex" xmlns:w16cid="http://schemas.microsoft.com/office/word/2016/wordml/cid" xmlns:w16="http://schemas.microsoft.com/office/word/2018/wordml" xmlns:w16sdtdh="http://schemas.microsoft.com/office/word/2020/wordml/sdtdatahash" xmlns:w16se="http://schemas.microsoft.com/office/word/2015/wordml/symex" xmlns:wpg="http://schemas.microsoft.com/office/word/2010/wordprocessingGroup" xmlns:wpi="http://schemas.microsoft.com/office/word/2010/wordprocessingInk" xmlns:wne="http://schemas.microsoft.com/office/word/2006/wordml" xmlns:wps="http://schemas.microsoft.com/office/word/2010/wordprocessingShape" mc:Ignorable="w14 w15 w16se w16cid w16 w16cex w16sdtdh wp14">
+<w:numbering xmlns:wpc="http://schemas.microsoft.com/office/word/2010/wordprocessingCanvas" xmlns:cx="http://schemas.microsoft.com/office/drawing/2014/chartex" xmlns:cx1="http://schemas.microsoft.com/office/drawing/2015/9/8/chartex" xmlns:cx2="http://schemas.microsoft.com/office/drawing/2015/10/21/chartex" xmlns:cx3="http://schemas.microsoft.com/office/drawing/2016/5/9/chartex" xmlns:cx4="http://schemas.microsoft.com/office/drawing/2016/5/10/chartex" xmlns:cx5="http://schemas.microsoft.com/office/drawing/2016/5/11/chartex" xmlns:cx6="http://schemas.microsoft.com/office/drawing/2016/5/12/chartex" xmlns:cx7="http://schemas.microsoft.com/office/drawing/2016/5/13/chartex" xmlns:cx8="http://schemas.microsoft.com/office/drawing/2016/5/14/chartex" xmlns:mc="http://schemas.openxmlformats.org/markup-compatibility/2006" xmlns:aink="http://schemas.microsoft.com/office/drawing/2016/ink" xmlns:am3d="http://schemas.microsoft.com/office/drawing/2017/model3d" xmlns:o="urn:schemas-microsoft-com:office:office" xmlns:oel="http://schemas.microsoft.com/office/2019/extlst" xmlns:r="http://schemas.openxmlformats.org/officeDocument/2006/relationships" xmlns:m="http://schemas.openxmlformats.org/officeDocument/2006/math" xmlns:v="urn:schemas-microsoft-com:vml" xmlns:wp14="http://schemas.microsoft.com/office/word/2010/wordprocessingDrawing" xmlns:wp="http://schemas.openxmlformats.org/drawingml/2006/wordprocessingDrawing" xmlns:w10="urn:schemas-microsoft-com:office:word" xmlns:w="http://schemas.openxmlformats.org/wordprocessingml/2006/main" xmlns:w14="http://schemas.microsoft.com/office/word/2010/wordml" xmlns:w15="http://schemas.microsoft.com/office/word/2012/wordml" xmlns:w16cex="http://schemas.microsoft.com/office/word/2018/wordml/cex" xmlns:w16cid="http://schemas.microsoft.com/office/word/2016/wordml/cid" xmlns:w16="http://schemas.microsoft.com/office/word/2018/wordml" xmlns:w16sdtdh="http://schemas.microsoft.com/office/word/2020/wordml/sdtdatahash" xmlns:w16se="http://schemas.microsoft.com/office/word/2015/wordml/symex" xmlns:wpg="http://schemas.microsoft.com/office/word/2010/wordprocessingGroup" xmlns:wpi="http://schemas.microsoft.com/office/word/2010/wordprocessingInk" xmlns:wne="http://schemas.microsoft.com/office/word/2006/wordml" xmlns:wps="http://schemas.microsoft.com/office/word/2010/wordprocessingShape" mc:Ignorable="w14 w15 w16se w16cid w16 w16cex w16sdtdh wp14">
   <w:numPicBullet w:numPicBulletId="0">
     <w:pict>
       <v:shapetype id="_x0000_t75" coordsize="21600,21600" o:spt="75" o:preferrelative="t" path="m@4@5l@4@11@9@11@9@5xe" filled="f" stroked="f">
@@ -538,7 +861,7 @@
         <v:path o:extrusionok="f" gradientshapeok="t" o:connecttype="rect"/>
         <o:lock v:ext="edit" aspectratio="t"/>
       </v:shapetype>
-      <v:shape id="_x0000_i1185" type="#_x0000_t75" style="width:50.5pt;height:52.5pt" o:bullet="t" o:allowoverlap="f">
+      <v:shape id="_x0000_i1042" type="#_x0000_t75" style="width:50.5pt;height:52.5pt" o:bullet="t" o:allowoverlap="f">
         <v:imagedata r:id="rId1" o:title="" croptop="4244f" cropbottom="1436f" cropright="2934f"/>
       </v:shape>
     </w:pict>
@@ -874,7 +1197,7 @@
     <w:lvl w:ilvl="0">
       <w:start w:val="1"/>
       <w:numFmt w:val="decimal"/>
-      <w:pStyle w:val="Heading1"/>
+      <w:pStyle w:val="1"/>
       <w:lvlText w:val="%1."/>
       <w:lvlJc w:val="left"/>
       <w:pPr>
@@ -933,7 +1256,7 @@
     <w:lvl w:ilvl="1">
       <w:start w:val="1"/>
       <w:numFmt w:val="decimal"/>
-      <w:pStyle w:val="Heading2"/>
+      <w:pStyle w:val="2"/>
       <w:lvlText w:val="%1.%2."/>
       <w:lvlJc w:val="left"/>
       <w:pPr>
@@ -992,7 +1315,7 @@
     <w:lvl w:ilvl="2">
       <w:start w:val="7"/>
       <w:numFmt w:val="decimal"/>
-      <w:pStyle w:val="Heading3"/>
+      <w:pStyle w:val="3"/>
       <w:lvlText w:val="%3.1.1)"/>
       <w:lvlJc w:val="left"/>
       <w:pPr>
@@ -1445,31 +1768,31 @@
       </w:rPr>
     </w:lvl>
   </w:abstractNum>
-  <w:num w:numId="1">
+  <w:num w:numId="1" w16cid:durableId="1207836088">
     <w:abstractNumId w:val="6"/>
   </w:num>
-  <w:num w:numId="2">
+  <w:num w:numId="2" w16cid:durableId="1453868531">
     <w:abstractNumId w:val="4"/>
   </w:num>
-  <w:num w:numId="3">
+  <w:num w:numId="3" w16cid:durableId="75058795">
     <w:abstractNumId w:val="0"/>
   </w:num>
-  <w:num w:numId="4">
+  <w:num w:numId="4" w16cid:durableId="250160875">
     <w:abstractNumId w:val="1"/>
   </w:num>
-  <w:num w:numId="5">
+  <w:num w:numId="5" w16cid:durableId="196161693">
     <w:abstractNumId w:val="5"/>
   </w:num>
-  <w:num w:numId="6">
+  <w:num w:numId="6" w16cid:durableId="1878002057">
     <w:abstractNumId w:val="3"/>
   </w:num>
-  <w:num w:numId="7">
+  <w:num w:numId="7" w16cid:durableId="104233573">
     <w:abstractNumId w:val="3"/>
     <w:lvlOverride w:ilvl="0">
       <w:lvl w:ilvl="0">
         <w:start w:val="1"/>
         <w:numFmt w:val="decimal"/>
-        <w:pStyle w:val="Heading1"/>
+        <w:pStyle w:val="1"/>
         <w:lvlText w:val="%1)"/>
         <w:lvlJc w:val="left"/>
         <w:pPr>
@@ -1484,7 +1807,7 @@
       <w:lvl w:ilvl="1">
         <w:start w:val="1"/>
         <w:numFmt w:val="decimal"/>
-        <w:pStyle w:val="Heading2"/>
+        <w:pStyle w:val="2"/>
         <w:lvlText w:val="%1.%2)"/>
         <w:lvlJc w:val="left"/>
         <w:pPr>
@@ -1499,7 +1822,7 @@
       <w:lvl w:ilvl="2">
         <w:start w:val="1"/>
         <w:numFmt w:val="decimal"/>
-        <w:pStyle w:val="Heading3"/>
+        <w:pStyle w:val="3"/>
         <w:lvlText w:val="%3.1.1)"/>
         <w:lvlJc w:val="left"/>
         <w:pPr>
@@ -1595,14 +1918,14 @@
       </w:lvl>
     </w:lvlOverride>
   </w:num>
-  <w:num w:numId="8">
+  <w:num w:numId="8" w16cid:durableId="1129131538">
     <w:abstractNumId w:val="3"/>
     <w:lvlOverride w:ilvl="0">
       <w:startOverride w:val="7"/>
       <w:lvl w:ilvl="0">
         <w:start w:val="7"/>
         <w:numFmt w:val="decimal"/>
-        <w:pStyle w:val="Heading1"/>
+        <w:pStyle w:val="1"/>
         <w:lvlText w:val="%1)"/>
         <w:lvlJc w:val="left"/>
         <w:pPr>
@@ -1618,7 +1941,7 @@
       <w:lvl w:ilvl="1">
         <w:start w:val="1"/>
         <w:numFmt w:val="decimal"/>
-        <w:pStyle w:val="Heading2"/>
+        <w:pStyle w:val="2"/>
         <w:lvlText w:val="%1.%2)"/>
         <w:lvlJc w:val="left"/>
         <w:pPr>
@@ -1634,7 +1957,7 @@
       <w:lvl w:ilvl="2">
         <w:start w:val="7"/>
         <w:numFmt w:val="decimal"/>
-        <w:pStyle w:val="Heading3"/>
+        <w:pStyle w:val="3"/>
         <w:lvlText w:val="%3.1.1)"/>
         <w:lvlJc w:val="left"/>
         <w:pPr>
@@ -1736,10 +2059,10 @@
       </w:lvl>
     </w:lvlOverride>
   </w:num>
-  <w:num w:numId="9">
+  <w:num w:numId="9" w16cid:durableId="25837990">
     <w:abstractNumId w:val="3"/>
   </w:num>
-  <w:num w:numId="10">
+  <w:num w:numId="10" w16cid:durableId="756054956">
     <w:abstractNumId w:val="2"/>
   </w:num>
 </w:numbering>
@@ -2134,7 +2457,7 @@
     <w:lsdException w:name="Unresolved Mention" w:semiHidden="1" w:unhideWhenUsed="1"/>
     <w:lsdException w:name="Smart Link" w:semiHidden="1" w:unhideWhenUsed="1"/>
   </w:latentStyles>
-  <w:style w:type="paragraph" w:default="1" w:styleId="Normal">
+  <w:style w:type="paragraph" w:default="1" w:styleId="a">
     <w:name w:val="Normal"/>
     <w:qFormat/>
     <w:rsid w:val="000D63AD"/>
@@ -2149,11 +2472,11 @@
       <w:lang w:val="uk-UA" w:eastAsia="en-US"/>
     </w:rPr>
   </w:style>
-  <w:style w:type="paragraph" w:styleId="Heading1">
+  <w:style w:type="paragraph" w:styleId="1">
     <w:name w:val="heading 1"/>
     <w:basedOn w:val="Normal1"/>
     <w:next w:val="Normal1"/>
-    <w:link w:val="Heading1Char"/>
+    <w:link w:val="10"/>
     <w:uiPriority w:val="99"/>
     <w:qFormat/>
     <w:rsid w:val="007A46AA"/>
@@ -2174,11 +2497,11 @@
       <w:szCs w:val="40"/>
     </w:rPr>
   </w:style>
-  <w:style w:type="paragraph" w:styleId="Heading2">
+  <w:style w:type="paragraph" w:styleId="2">
     <w:name w:val="heading 2"/>
     <w:basedOn w:val="Normal1"/>
     <w:next w:val="Normal1"/>
-    <w:link w:val="Heading2Char"/>
+    <w:link w:val="20"/>
     <w:uiPriority w:val="99"/>
     <w:qFormat/>
     <w:rsid w:val="000D3967"/>
@@ -2199,11 +2522,11 @@
       <w:szCs w:val="32"/>
     </w:rPr>
   </w:style>
-  <w:style w:type="paragraph" w:styleId="Heading3">
+  <w:style w:type="paragraph" w:styleId="3">
     <w:name w:val="heading 3"/>
     <w:basedOn w:val="Normal1"/>
     <w:next w:val="Normal1"/>
-    <w:link w:val="Heading3Char"/>
+    <w:link w:val="30"/>
     <w:uiPriority w:val="99"/>
     <w:qFormat/>
     <w:rsid w:val="00667D9E"/>
@@ -2224,11 +2547,11 @@
       <w:szCs w:val="28"/>
     </w:rPr>
   </w:style>
-  <w:style w:type="paragraph" w:styleId="Heading4">
+  <w:style w:type="paragraph" w:styleId="4">
     <w:name w:val="heading 4"/>
     <w:basedOn w:val="Normal1"/>
     <w:next w:val="Normal1"/>
-    <w:link w:val="Heading4Char"/>
+    <w:link w:val="40"/>
     <w:uiPriority w:val="99"/>
     <w:qFormat/>
     <w:rsid w:val="001E0CF9"/>
@@ -2244,11 +2567,11 @@
       <w:szCs w:val="24"/>
     </w:rPr>
   </w:style>
-  <w:style w:type="paragraph" w:styleId="Heading5">
+  <w:style w:type="paragraph" w:styleId="5">
     <w:name w:val="heading 5"/>
     <w:basedOn w:val="Normal1"/>
     <w:next w:val="Normal1"/>
-    <w:link w:val="Heading5Char"/>
+    <w:link w:val="50"/>
     <w:uiPriority w:val="99"/>
     <w:qFormat/>
     <w:rsid w:val="001E0CF9"/>
@@ -2262,11 +2585,11 @@
       <w:color w:val="666666"/>
     </w:rPr>
   </w:style>
-  <w:style w:type="paragraph" w:styleId="Heading6">
+  <w:style w:type="paragraph" w:styleId="6">
     <w:name w:val="heading 6"/>
     <w:basedOn w:val="Normal1"/>
     <w:next w:val="Normal1"/>
-    <w:link w:val="Heading6Char"/>
+    <w:link w:val="60"/>
     <w:uiPriority w:val="99"/>
     <w:qFormat/>
     <w:rsid w:val="001E0CF9"/>
@@ -2281,13 +2604,13 @@
       <w:color w:val="666666"/>
     </w:rPr>
   </w:style>
-  <w:style w:type="character" w:default="1" w:styleId="DefaultParagraphFont">
+  <w:style w:type="character" w:default="1" w:styleId="a0">
     <w:name w:val="Default Paragraph Font"/>
     <w:uiPriority w:val="1"/>
     <w:semiHidden/>
     <w:unhideWhenUsed/>
   </w:style>
-  <w:style w:type="table" w:default="1" w:styleId="TableNormal">
+  <w:style w:type="table" w:default="1" w:styleId="a1">
     <w:name w:val="Normal Table"/>
     <w:uiPriority w:val="99"/>
     <w:semiHidden/>
@@ -2302,15 +2625,15 @@
       </w:tblCellMar>
     </w:tblPr>
   </w:style>
-  <w:style w:type="numbering" w:default="1" w:styleId="NoList">
+  <w:style w:type="numbering" w:default="1" w:styleId="a2">
     <w:name w:val="No List"/>
     <w:uiPriority w:val="99"/>
     <w:semiHidden/>
     <w:unhideWhenUsed/>
   </w:style>
-  <w:style w:type="character" w:customStyle="1" w:styleId="Heading1Char">
-    <w:name w:val="Heading 1 Char"/>
-    <w:link w:val="Heading1"/>
+  <w:style w:type="character" w:customStyle="1" w:styleId="10">
+    <w:name w:val="Заголовок 1 Знак"/>
+    <w:link w:val="1"/>
     <w:uiPriority w:val="99"/>
     <w:locked/>
     <w:rsid w:val="007A46AA"/>
@@ -2322,9 +2645,9 @@
       <w:lang w:val="en-US" w:eastAsia="en-US"/>
     </w:rPr>
   </w:style>
-  <w:style w:type="character" w:customStyle="1" w:styleId="Heading2Char">
-    <w:name w:val="Heading 2 Char"/>
-    <w:link w:val="Heading2"/>
+  <w:style w:type="character" w:customStyle="1" w:styleId="20">
+    <w:name w:val="Заголовок 2 Знак"/>
+    <w:link w:val="2"/>
     <w:uiPriority w:val="99"/>
     <w:locked/>
     <w:rsid w:val="000D3967"/>
@@ -2336,9 +2659,9 @@
       <w:lang w:val="en-US" w:eastAsia="en-US"/>
     </w:rPr>
   </w:style>
-  <w:style w:type="character" w:customStyle="1" w:styleId="Heading3Char">
-    <w:name w:val="Heading 3 Char"/>
-    <w:link w:val="Heading3"/>
+  <w:style w:type="character" w:customStyle="1" w:styleId="30">
+    <w:name w:val="Заголовок 3 Знак"/>
+    <w:link w:val="3"/>
     <w:uiPriority w:val="99"/>
     <w:locked/>
     <w:rsid w:val="00667D9E"/>
@@ -2350,9 +2673,9 @@
       <w:lang w:val="en-US" w:eastAsia="en-US"/>
     </w:rPr>
   </w:style>
-  <w:style w:type="character" w:customStyle="1" w:styleId="Heading4Char">
-    <w:name w:val="Heading 4 Char"/>
-    <w:link w:val="Heading4"/>
+  <w:style w:type="character" w:customStyle="1" w:styleId="40">
+    <w:name w:val="Заголовок 4 Знак"/>
+    <w:link w:val="4"/>
     <w:uiPriority w:val="99"/>
     <w:semiHidden/>
     <w:locked/>
@@ -2364,9 +2687,9 @@
       <w:szCs w:val="28"/>
     </w:rPr>
   </w:style>
-  <w:style w:type="character" w:customStyle="1" w:styleId="Heading5Char">
-    <w:name w:val="Heading 5 Char"/>
-    <w:link w:val="Heading5"/>
+  <w:style w:type="character" w:customStyle="1" w:styleId="50">
+    <w:name w:val="Заголовок 5 Знак"/>
+    <w:link w:val="5"/>
     <w:uiPriority w:val="99"/>
     <w:semiHidden/>
     <w:locked/>
@@ -2380,9 +2703,9 @@
       <w:szCs w:val="26"/>
     </w:rPr>
   </w:style>
-  <w:style w:type="character" w:customStyle="1" w:styleId="Heading6Char">
-    <w:name w:val="Heading 6 Char"/>
-    <w:link w:val="Heading6"/>
+  <w:style w:type="character" w:customStyle="1" w:styleId="60">
+    <w:name w:val="Заголовок 6 Знак"/>
+    <w:link w:val="6"/>
     <w:uiPriority w:val="99"/>
     <w:semiHidden/>
     <w:locked/>
@@ -2406,7 +2729,7 @@
       <w:lang w:val="en-US" w:eastAsia="en-US"/>
     </w:rPr>
   </w:style>
-  <w:style w:type="table" w:customStyle="1" w:styleId="TableNormal0">
+  <w:style w:type="table" w:customStyle="1" w:styleId="TableNormal">
     <w:name w:val="TableNormal"/>
     <w:uiPriority w:val="99"/>
     <w:rsid w:val="001E0CF9"/>
@@ -2427,11 +2750,11 @@
       </w:tblCellMar>
     </w:tblPr>
   </w:style>
-  <w:style w:type="paragraph" w:styleId="Title">
+  <w:style w:type="paragraph" w:styleId="a3">
     <w:name w:val="Title"/>
     <w:basedOn w:val="Normal1"/>
     <w:next w:val="Normal1"/>
-    <w:link w:val="TitleChar"/>
+    <w:link w:val="a4"/>
     <w:uiPriority w:val="99"/>
     <w:qFormat/>
     <w:rsid w:val="001E0CF9"/>
@@ -2445,9 +2768,9 @@
       <w:szCs w:val="52"/>
     </w:rPr>
   </w:style>
-  <w:style w:type="character" w:customStyle="1" w:styleId="TitleChar">
-    <w:name w:val="Title Char"/>
-    <w:link w:val="Title"/>
+  <w:style w:type="character" w:customStyle="1" w:styleId="a4">
+    <w:name w:val="Назва Знак"/>
+    <w:link w:val="a3"/>
     <w:uiPriority w:val="99"/>
     <w:locked/>
     <w:rPr>
@@ -2459,11 +2782,11 @@
       <w:szCs w:val="32"/>
     </w:rPr>
   </w:style>
-  <w:style w:type="paragraph" w:styleId="Subtitle">
+  <w:style w:type="paragraph" w:styleId="a5">
     <w:name w:val="Subtitle"/>
     <w:basedOn w:val="Normal1"/>
     <w:next w:val="Normal1"/>
-    <w:link w:val="SubtitleChar"/>
+    <w:link w:val="a6"/>
     <w:uiPriority w:val="99"/>
     <w:qFormat/>
     <w:rsid w:val="001E0CF9"/>
@@ -2478,9 +2801,9 @@
       <w:szCs w:val="30"/>
     </w:rPr>
   </w:style>
-  <w:style w:type="character" w:customStyle="1" w:styleId="SubtitleChar">
-    <w:name w:val="Subtitle Char"/>
-    <w:link w:val="Subtitle"/>
+  <w:style w:type="character" w:customStyle="1" w:styleId="a6">
+    <w:name w:val="Підзаголовок Знак"/>
+    <w:link w:val="a5"/>
     <w:uiPriority w:val="99"/>
     <w:locked/>
     <w:rPr>
@@ -2489,9 +2812,9 @@
       <w:szCs w:val="24"/>
     </w:rPr>
   </w:style>
-  <w:style w:type="table" w:customStyle="1" w:styleId="a">
+  <w:style w:type="table" w:customStyle="1" w:styleId="a7">
     <w:name w:val="Стиль"/>
-    <w:basedOn w:val="TableNormal0"/>
+    <w:basedOn w:val="TableNormal"/>
     <w:uiPriority w:val="99"/>
     <w:rsid w:val="001E0CF9"/>
     <w:tblPr>
@@ -2507,7 +2830,7 @@
   </w:style>
   <w:style w:type="table" w:customStyle="1" w:styleId="13">
     <w:name w:val="Стиль13"/>
-    <w:basedOn w:val="TableNormal0"/>
+    <w:basedOn w:val="TableNormal"/>
     <w:uiPriority w:val="99"/>
     <w:rsid w:val="001E0CF9"/>
     <w:tblPr>
@@ -2523,7 +2846,7 @@
   </w:style>
   <w:style w:type="table" w:customStyle="1" w:styleId="12">
     <w:name w:val="Стиль12"/>
-    <w:basedOn w:val="TableNormal0"/>
+    <w:basedOn w:val="TableNormal"/>
     <w:uiPriority w:val="99"/>
     <w:rsid w:val="001E0CF9"/>
     <w:tblPr>
@@ -2539,7 +2862,7 @@
   </w:style>
   <w:style w:type="table" w:customStyle="1" w:styleId="11">
     <w:name w:val="Стиль11"/>
-    <w:basedOn w:val="TableNormal0"/>
+    <w:basedOn w:val="TableNormal"/>
     <w:uiPriority w:val="99"/>
     <w:rsid w:val="001E0CF9"/>
     <w:tblPr>
@@ -2553,9 +2876,9 @@
       </w:tblCellMar>
     </w:tblPr>
   </w:style>
-  <w:style w:type="table" w:customStyle="1" w:styleId="10">
+  <w:style w:type="table" w:customStyle="1" w:styleId="100">
     <w:name w:val="Стиль10"/>
-    <w:basedOn w:val="TableNormal0"/>
+    <w:basedOn w:val="TableNormal"/>
     <w:uiPriority w:val="99"/>
     <w:rsid w:val="001E0CF9"/>
     <w:tblPr>
@@ -2571,7 +2894,7 @@
   </w:style>
   <w:style w:type="table" w:customStyle="1" w:styleId="9">
     <w:name w:val="Стиль9"/>
-    <w:basedOn w:val="TableNormal0"/>
+    <w:basedOn w:val="TableNormal"/>
     <w:uiPriority w:val="99"/>
     <w:rsid w:val="001E0CF9"/>
     <w:tblPr>
@@ -2587,7 +2910,7 @@
   </w:style>
   <w:style w:type="table" w:customStyle="1" w:styleId="8">
     <w:name w:val="Стиль8"/>
-    <w:basedOn w:val="TableNormal0"/>
+    <w:basedOn w:val="TableNormal"/>
     <w:uiPriority w:val="99"/>
     <w:rsid w:val="001E0CF9"/>
     <w:tblPr>
@@ -2603,7 +2926,7 @@
   </w:style>
   <w:style w:type="table" w:customStyle="1" w:styleId="7">
     <w:name w:val="Стиль7"/>
-    <w:basedOn w:val="TableNormal0"/>
+    <w:basedOn w:val="TableNormal"/>
     <w:uiPriority w:val="99"/>
     <w:rsid w:val="001E0CF9"/>
     <w:tblPr>
@@ -2617,9 +2940,9 @@
       </w:tblCellMar>
     </w:tblPr>
   </w:style>
-  <w:style w:type="table" w:customStyle="1" w:styleId="6">
+  <w:style w:type="table" w:customStyle="1" w:styleId="61">
     <w:name w:val="Стиль6"/>
-    <w:basedOn w:val="TableNormal0"/>
+    <w:basedOn w:val="TableNormal"/>
     <w:uiPriority w:val="99"/>
     <w:rsid w:val="001E0CF9"/>
     <w:tblPr>
@@ -2633,9 +2956,9 @@
       </w:tblCellMar>
     </w:tblPr>
   </w:style>
-  <w:style w:type="table" w:customStyle="1" w:styleId="5">
+  <w:style w:type="table" w:customStyle="1" w:styleId="51">
     <w:name w:val="Стиль5"/>
-    <w:basedOn w:val="TableNormal0"/>
+    <w:basedOn w:val="TableNormal"/>
     <w:uiPriority w:val="99"/>
     <w:rsid w:val="001E0CF9"/>
     <w:tblPr>
@@ -2649,9 +2972,9 @@
       </w:tblCellMar>
     </w:tblPr>
   </w:style>
-  <w:style w:type="table" w:customStyle="1" w:styleId="4">
+  <w:style w:type="table" w:customStyle="1" w:styleId="41">
     <w:name w:val="Стиль4"/>
-    <w:basedOn w:val="TableNormal0"/>
+    <w:basedOn w:val="TableNormal"/>
     <w:uiPriority w:val="99"/>
     <w:rsid w:val="001E0CF9"/>
     <w:tblPr>
@@ -2665,9 +2988,9 @@
       </w:tblCellMar>
     </w:tblPr>
   </w:style>
-  <w:style w:type="table" w:customStyle="1" w:styleId="3">
+  <w:style w:type="table" w:customStyle="1" w:styleId="31">
     <w:name w:val="Стиль3"/>
-    <w:basedOn w:val="TableNormal0"/>
+    <w:basedOn w:val="TableNormal"/>
     <w:uiPriority w:val="99"/>
     <w:rsid w:val="001E0CF9"/>
     <w:tblPr>
@@ -2681,9 +3004,9 @@
       </w:tblCellMar>
     </w:tblPr>
   </w:style>
-  <w:style w:type="table" w:customStyle="1" w:styleId="2">
+  <w:style w:type="table" w:customStyle="1" w:styleId="21">
     <w:name w:val="Стиль2"/>
-    <w:basedOn w:val="TableNormal0"/>
+    <w:basedOn w:val="TableNormal"/>
     <w:uiPriority w:val="99"/>
     <w:rsid w:val="001E0CF9"/>
     <w:tblPr>
@@ -2697,9 +3020,9 @@
       </w:tblCellMar>
     </w:tblPr>
   </w:style>
-  <w:style w:type="table" w:customStyle="1" w:styleId="1">
+  <w:style w:type="table" w:customStyle="1" w:styleId="14">
     <w:name w:val="Стиль1"/>
-    <w:basedOn w:val="TableNormal0"/>
+    <w:basedOn w:val="TableNormal"/>
     <w:uiPriority w:val="99"/>
     <w:rsid w:val="001E0CF9"/>
     <w:tblPr>
@@ -2713,10 +3036,10 @@
       </w:tblCellMar>
     </w:tblPr>
   </w:style>
-  <w:style w:type="paragraph" w:styleId="Caption">
+  <w:style w:type="paragraph" w:styleId="a8">
     <w:name w:val="caption"/>
-    <w:basedOn w:val="Normal"/>
-    <w:next w:val="Normal"/>
+    <w:basedOn w:val="a"/>
+    <w:next w:val="a"/>
     <w:uiPriority w:val="99"/>
     <w:qFormat/>
     <w:locked/>
@@ -2730,7 +3053,7 @@
       <w:szCs w:val="20"/>
     </w:rPr>
   </w:style>
-  <w:style w:type="character" w:styleId="Hyperlink">
+  <w:style w:type="character" w:styleId="a9">
     <w:name w:val="Hyperlink"/>
     <w:uiPriority w:val="99"/>
     <w:rsid w:val="000C271F"/>
@@ -2740,7 +3063,7 @@
       <w:u w:val="single"/>
     </w:rPr>
   </w:style>
-  <w:style w:type="character" w:styleId="UnresolvedMention">
+  <w:style w:type="character" w:styleId="aa">
     <w:name w:val="Unresolved Mention"/>
     <w:uiPriority w:val="99"/>
     <w:semiHidden/>
@@ -2751,7 +3074,7 @@
       <w:shd w:val="clear" w:color="auto" w:fill="E1DFDD"/>
     </w:rPr>
   </w:style>
-  <w:style w:type="character" w:styleId="FollowedHyperlink">
+  <w:style w:type="character" w:styleId="ab">
     <w:name w:val="FollowedHyperlink"/>
     <w:uiPriority w:val="99"/>
     <w:semiHidden/>
@@ -2762,7 +3085,7 @@
       <w:u w:val="single"/>
     </w:rPr>
   </w:style>
-  <w:style w:type="character" w:styleId="CommentReference">
+  <w:style w:type="character" w:styleId="ac">
     <w:name w:val="annotation reference"/>
     <w:uiPriority w:val="99"/>
     <w:semiHidden/>
@@ -2773,10 +3096,10 @@
       <w:szCs w:val="16"/>
     </w:rPr>
   </w:style>
-  <w:style w:type="paragraph" w:styleId="CommentText">
+  <w:style w:type="paragraph" w:styleId="ad">
     <w:name w:val="annotation text"/>
-    <w:basedOn w:val="Normal"/>
-    <w:link w:val="CommentTextChar"/>
+    <w:basedOn w:val="a"/>
+    <w:link w:val="ae"/>
     <w:uiPriority w:val="99"/>
     <w:semiHidden/>
     <w:unhideWhenUsed/>
@@ -2786,9 +3109,9 @@
       <w:szCs w:val="20"/>
     </w:rPr>
   </w:style>
-  <w:style w:type="character" w:customStyle="1" w:styleId="CommentTextChar">
-    <w:name w:val="Comment Text Char"/>
-    <w:link w:val="CommentText"/>
+  <w:style w:type="character" w:customStyle="1" w:styleId="ae">
+    <w:name w:val="Текст примітки Знак"/>
+    <w:link w:val="ad"/>
     <w:uiPriority w:val="99"/>
     <w:semiHidden/>
     <w:rsid w:val="00667D9E"/>
@@ -2796,11 +3119,11 @@
       <w:lang w:val="en-US" w:eastAsia="en-US"/>
     </w:rPr>
   </w:style>
-  <w:style w:type="paragraph" w:styleId="CommentSubject">
+  <w:style w:type="paragraph" w:styleId="af">
     <w:name w:val="annotation subject"/>
-    <w:basedOn w:val="CommentText"/>
-    <w:next w:val="CommentText"/>
-    <w:link w:val="CommentSubjectChar"/>
+    <w:basedOn w:val="ad"/>
+    <w:next w:val="ad"/>
+    <w:link w:val="af0"/>
     <w:uiPriority w:val="99"/>
     <w:semiHidden/>
     <w:unhideWhenUsed/>
@@ -2810,9 +3133,9 @@
       <w:bCs/>
     </w:rPr>
   </w:style>
-  <w:style w:type="character" w:customStyle="1" w:styleId="CommentSubjectChar">
-    <w:name w:val="Comment Subject Char"/>
-    <w:link w:val="CommentSubject"/>
+  <w:style w:type="character" w:customStyle="1" w:styleId="af0">
+    <w:name w:val="Тема примітки Знак"/>
+    <w:link w:val="af"/>
     <w:uiPriority w:val="99"/>
     <w:semiHidden/>
     <w:rsid w:val="00667D9E"/>
@@ -2842,7 +3165,7 @@
   </w:style>
   <w:style w:type="character" w:customStyle="1" w:styleId="Normal1Char">
     <w:name w:val="Normal1 Char"/>
-    <w:basedOn w:val="DefaultParagraphFont"/>
+    <w:basedOn w:val="a0"/>
     <w:link w:val="Normal1"/>
     <w:uiPriority w:val="99"/>
     <w:rsid w:val="008E46BC"/>
@@ -2859,6 +3182,62 @@
     <w:rsid w:val="008E46BC"/>
     <w:rPr>
       <w:rFonts w:asciiTheme="minorHAnsi" w:hAnsiTheme="minorHAnsi" w:cstheme="minorHAnsi"/>
+      <w:sz w:val="28"/>
+      <w:szCs w:val="28"/>
+      <w:lang w:val="uk-UA" w:eastAsia="en-US"/>
+    </w:rPr>
+  </w:style>
+  <w:style w:type="paragraph" w:styleId="af1">
+    <w:name w:val="header"/>
+    <w:basedOn w:val="a"/>
+    <w:link w:val="af2"/>
+    <w:uiPriority w:val="99"/>
+    <w:unhideWhenUsed/>
+    <w:rsid w:val="00F41ADE"/>
+    <w:pPr>
+      <w:tabs>
+        <w:tab w:val="center" w:pos="4819"/>
+        <w:tab w:val="right" w:pos="9639"/>
+      </w:tabs>
+    </w:pPr>
+  </w:style>
+  <w:style w:type="character" w:customStyle="1" w:styleId="af2">
+    <w:name w:val="Верхній колонтитул Знак"/>
+    <w:basedOn w:val="a0"/>
+    <w:link w:val="af1"/>
+    <w:uiPriority w:val="99"/>
+    <w:rsid w:val="00F41ADE"/>
+    <w:rPr>
+      <w:rFonts w:asciiTheme="minorHAnsi" w:hAnsiTheme="minorHAnsi" w:cstheme="minorHAnsi"/>
+      <w:noProof/>
+      <w:sz w:val="28"/>
+      <w:szCs w:val="28"/>
+      <w:lang w:val="uk-UA" w:eastAsia="en-US"/>
+    </w:rPr>
+  </w:style>
+  <w:style w:type="paragraph" w:styleId="af3">
+    <w:name w:val="footer"/>
+    <w:basedOn w:val="a"/>
+    <w:link w:val="af4"/>
+    <w:uiPriority w:val="99"/>
+    <w:unhideWhenUsed/>
+    <w:rsid w:val="00F41ADE"/>
+    <w:pPr>
+      <w:tabs>
+        <w:tab w:val="center" w:pos="4819"/>
+        <w:tab w:val="right" w:pos="9639"/>
+      </w:tabs>
+    </w:pPr>
+  </w:style>
+  <w:style w:type="character" w:customStyle="1" w:styleId="af4">
+    <w:name w:val="Нижній колонтитул Знак"/>
+    <w:basedOn w:val="a0"/>
+    <w:link w:val="af3"/>
+    <w:uiPriority w:val="99"/>
+    <w:rsid w:val="00F41ADE"/>
+    <w:rPr>
+      <w:rFonts w:asciiTheme="minorHAnsi" w:hAnsiTheme="minorHAnsi" w:cstheme="minorHAnsi"/>
+      <w:noProof/>
       <w:sz w:val="28"/>
       <w:szCs w:val="28"/>
       <w:lang w:val="uk-UA" w:eastAsia="en-US"/>

</xml_diff>